<commit_message>
1. done, 2. done, 3. 50/50, 4. done
</commit_message>
<xml_diff>
--- a/Практическая работа №1 Карась Д. А. ИВБ-411 АИТ.docx
+++ b/Практическая работа №1 Карась Д. А. ИВБ-411 АИТ.docx
@@ -1400,7 +1400,27 @@
           <w:szCs w:val="28"/>
           <w:lang w:eastAsia="ru-RU"/>
         </w:rPr>
-        <w:t>2025г.</w:t>
+        <w:t>202</w:t>
+      </w:r>
+      <w:r>
+        <w:rPr>
+          <w:rFonts w:ascii="Times New Roman" w:eastAsia="Times New Roman" w:hAnsi="Times New Roman" w:cs="Times New Roman"/>
+          <w:b/>
+          <w:sz w:val="28"/>
+          <w:szCs w:val="28"/>
+          <w:lang w:val="en-US" w:eastAsia="ru-RU"/>
+        </w:rPr>
+        <w:t>6</w:t>
+      </w:r>
+      <w:r>
+        <w:rPr>
+          <w:rFonts w:ascii="Times New Roman" w:eastAsia="Times New Roman" w:hAnsi="Times New Roman" w:cs="Times New Roman"/>
+          <w:b/>
+          <w:sz w:val="28"/>
+          <w:szCs w:val="28"/>
+          <w:lang w:eastAsia="ru-RU"/>
+        </w:rPr>
+        <w:t>г.</w:t>
       </w:r>
     </w:p>
     <w:p>
@@ -2092,15 +2112,7 @@
           <w:sz w:val="28"/>
           <w:szCs w:val="28"/>
         </w:rPr>
-        <w:t xml:space="preserve"> </w:t>
-      </w:r>
-      <w:r>
-        <w:rPr>
-          <w:rFonts w:ascii="Times New Roman" w:hAnsi="Times New Roman" w:cs="Times New Roman"/>
-          <w:sz w:val="28"/>
-          <w:szCs w:val="28"/>
-        </w:rPr>
-        <w:t>​ и стоимостью v</w:t>
+        <w:t xml:space="preserve"> ​ и стоимостью v</w:t>
       </w:r>
       <w:proofErr w:type="spellStart"/>
       <w:r>
@@ -2120,15 +2132,7 @@
           <w:sz w:val="28"/>
           <w:szCs w:val="28"/>
         </w:rPr>
-        <w:t xml:space="preserve"> </w:t>
-      </w:r>
-      <w:r>
-        <w:rPr>
-          <w:rFonts w:ascii="Times New Roman" w:hAnsi="Times New Roman" w:cs="Times New Roman"/>
-          <w:sz w:val="28"/>
-          <w:szCs w:val="28"/>
-        </w:rPr>
-        <w:t xml:space="preserve">​. Для каждого предмета можно либо взять его целиком (1), либо не брать вовсе (0). Частично брать предметы нельзя. Цель — выбрать предметы так, чтобы суммарный вес не превышал </w:t>
+        <w:t xml:space="preserve"> ​. Для каждого предмета можно либо взять его целиком (1), либо не брать вовсе (0). Частично брать предметы нельзя. Цель — выбрать предметы так, чтобы суммарный вес не превышал </w:t>
       </w:r>
       <w:proofErr w:type="gramStart"/>
       <w:r>
@@ -4230,6 +4234,7 @@
   <w:style w:type="character" w:default="1" w:styleId="a0">
     <w:name w:val="Default Paragraph Font"/>
     <w:uiPriority w:val="1"/>
+    <w:semiHidden/>
     <w:unhideWhenUsed/>
   </w:style>
   <w:style w:type="table" w:default="1" w:styleId="a1">

</xml_diff>